<commit_message>
Fix syntax errors and screenshots
</commit_message>
<xml_diff>
--- a/sql2q2/sql2q2_images.docx
+++ b/sql2q2/sql2q2_images.docx
@@ -104,15 +104,20 @@
       </w:r>
     </w:p>
     <w:p>
+      <w:pPr>
+        <w:rPr>
+          <w:rtl/>
+        </w:rPr>
+      </w:pPr>
       <w:r>
         <w:rPr>
           <w:noProof/>
         </w:rPr>
         <w:drawing>
-          <wp:inline distT="0" distB="0" distL="0" distR="0" wp14:anchorId="77AEAB38" wp14:editId="1CF4E822">
-            <wp:extent cx="3238500" cy="762000"/>
-            <wp:effectExtent l="0" t="0" r="0" b="0"/>
-            <wp:docPr id="2" name="תמונה 2"/>
+          <wp:inline distT="0" distB="0" distL="0" distR="0" wp14:anchorId="05F4E7C5" wp14:editId="137196D1">
+            <wp:extent cx="2752725" cy="419100"/>
+            <wp:effectExtent l="0" t="0" r="9525" b="0"/>
+            <wp:docPr id="5" name="תמונה 5"/>
             <wp:cNvGraphicFramePr>
               <a:graphicFrameLocks xmlns:a="http://schemas.openxmlformats.org/drawingml/2006/main" noChangeAspect="1"/>
             </wp:cNvGraphicFramePr>
@@ -132,7 +137,7 @@
                   <pic:spPr>
                     <a:xfrm>
                       <a:off x="0" y="0"/>
-                      <a:ext cx="3238500" cy="762000"/>
+                      <a:ext cx="2752725" cy="419100"/>
                     </a:xfrm>
                     <a:prstGeom prst="rect">
                       <a:avLst/>
@@ -152,25 +157,14 @@
         </w:rPr>
       </w:pPr>
       <w:r>
-        <w:t>d:</w:t>
-      </w:r>
-    </w:p>
-    <w:p>
-      <w:pPr>
-        <w:rPr>
-          <w:rFonts w:hint="cs"/>
-          <w:rtl/>
-        </w:rPr>
-      </w:pPr>
-      <w:r>
         <w:rPr>
           <w:noProof/>
         </w:rPr>
         <w:drawing>
-          <wp:inline distT="0" distB="0" distL="0" distR="0" wp14:anchorId="308C9387" wp14:editId="6F6848EE">
-            <wp:extent cx="2819400" cy="419100"/>
-            <wp:effectExtent l="0" t="0" r="0" b="0"/>
-            <wp:docPr id="3" name="תמונה 3"/>
+          <wp:inline distT="0" distB="0" distL="0" distR="0" wp14:anchorId="44F0BB12" wp14:editId="701DE74C">
+            <wp:extent cx="2981325" cy="371475"/>
+            <wp:effectExtent l="0" t="0" r="9525" b="9525"/>
+            <wp:docPr id="6" name="תמונה 6"/>
             <wp:cNvGraphicFramePr>
               <a:graphicFrameLocks xmlns:a="http://schemas.openxmlformats.org/drawingml/2006/main" noChangeAspect="1"/>
             </wp:cNvGraphicFramePr>
@@ -190,7 +184,7 @@
                   <pic:spPr>
                     <a:xfrm>
                       <a:off x="0" y="0"/>
-                      <a:ext cx="2819400" cy="419100"/>
+                      <a:ext cx="2981325" cy="371475"/>
                     </a:xfrm>
                     <a:prstGeom prst="rect">
                       <a:avLst/>
@@ -202,15 +196,42 @@
           </wp:inline>
         </w:drawing>
       </w:r>
+    </w:p>
+    <w:p>
+      <w:pPr>
+        <w:rPr>
+          <w:rFonts w:hint="cs"/>
+          <w:rtl/>
+        </w:rPr>
+      </w:pPr>
+    </w:p>
+    <w:p>
+      <w:pPr>
+        <w:rPr>
+          <w:rtl/>
+        </w:rPr>
+      </w:pPr>
+      <w:r>
+        <w:t>d:</w:t>
+      </w:r>
+    </w:p>
+    <w:p>
+      <w:pPr>
+        <w:rPr>
+          <w:rtl/>
+        </w:rPr>
+      </w:pPr>
+      <w:bookmarkStart w:id="0" w:name="_GoBack"/>
+      <w:bookmarkEnd w:id="0"/>
       <w:r>
         <w:rPr>
           <w:noProof/>
         </w:rPr>
         <w:drawing>
-          <wp:inline distT="0" distB="0" distL="0" distR="0" wp14:anchorId="6A25D39F" wp14:editId="75556842">
-            <wp:extent cx="2600325" cy="666750"/>
-            <wp:effectExtent l="0" t="0" r="9525" b="0"/>
-            <wp:docPr id="4" name="תמונה 4"/>
+          <wp:inline distT="0" distB="0" distL="0" distR="0" wp14:anchorId="308C9387" wp14:editId="6F6848EE">
+            <wp:extent cx="2819400" cy="419100"/>
+            <wp:effectExtent l="0" t="0" r="0" b="0"/>
+            <wp:docPr id="3" name="תמונה 3"/>
             <wp:cNvGraphicFramePr>
               <a:graphicFrameLocks xmlns:a="http://schemas.openxmlformats.org/drawingml/2006/main" noChangeAspect="1"/>
             </wp:cNvGraphicFramePr>
@@ -230,6 +251,46 @@
                   <pic:spPr>
                     <a:xfrm>
                       <a:off x="0" y="0"/>
+                      <a:ext cx="2819400" cy="419100"/>
+                    </a:xfrm>
+                    <a:prstGeom prst="rect">
+                      <a:avLst/>
+                    </a:prstGeom>
+                  </pic:spPr>
+                </pic:pic>
+              </a:graphicData>
+            </a:graphic>
+          </wp:inline>
+        </w:drawing>
+      </w:r>
+      <w:r>
+        <w:rPr>
+          <w:noProof/>
+        </w:rPr>
+        <w:drawing>
+          <wp:inline distT="0" distB="0" distL="0" distR="0" wp14:anchorId="6A25D39F" wp14:editId="75556842">
+            <wp:extent cx="2600325" cy="666750"/>
+            <wp:effectExtent l="0" t="0" r="9525" b="0"/>
+            <wp:docPr id="4" name="תמונה 4"/>
+            <wp:cNvGraphicFramePr>
+              <a:graphicFrameLocks xmlns:a="http://schemas.openxmlformats.org/drawingml/2006/main" noChangeAspect="1"/>
+            </wp:cNvGraphicFramePr>
+            <a:graphic xmlns:a="http://schemas.openxmlformats.org/drawingml/2006/main">
+              <a:graphicData uri="http://schemas.openxmlformats.org/drawingml/2006/picture">
+                <pic:pic xmlns:pic="http://schemas.openxmlformats.org/drawingml/2006/picture">
+                  <pic:nvPicPr>
+                    <pic:cNvPr id="1" name=""/>
+                    <pic:cNvPicPr/>
+                  </pic:nvPicPr>
+                  <pic:blipFill>
+                    <a:blip r:embed="rId8"/>
+                    <a:stretch>
+                      <a:fillRect/>
+                    </a:stretch>
+                  </pic:blipFill>
+                  <pic:spPr>
+                    <a:xfrm>
+                      <a:off x="0" y="0"/>
                       <a:ext cx="2600325" cy="666750"/>
                     </a:xfrm>
                     <a:prstGeom prst="rect">
@@ -242,8 +303,6 @@
           </wp:inline>
         </w:drawing>
       </w:r>
-      <w:bookmarkStart w:id="0" w:name="_GoBack"/>
-      <w:bookmarkEnd w:id="0"/>
     </w:p>
     <w:sectPr>
       <w:pgSz w:w="11906" w:h="16838"/>

</xml_diff>